<commit_message>
LED: COB-Streifen WS2812B FCOB (26 LEDs) + gedruckte Diffusor-Leiste statt WS2812-ECO-Streifen; alle abgeleiteten Dateien aktualisiert
- Gehäuse: Lichtkammer aus Parametern (cob_t = 2,5 mm, nachmessen), Falz für 1-mm-Diffusor, neues Teil diffusor_led.stl,
  Module/Deckeldom nach hinten verschoben, Kollisionsprüfungen parts_check/diff_check, Pololu S13V10F5 statt MT3608-Kommentar
- Vorschaubilder (21), STL, Renderbilder, 3D-Modell (20 Teile inkl. COB-LED-Streifen und Diffusor) neu erzeugt
- Firmware: LED_ANZAHL 26, LED_HELLIGKEIT max. 80 (static_assert, Strombudget), diagram.json 26 Pixel, Builds 08.10.2026
- Vorkalkulation, Einkaufsliste, Steckbrief, README, Anleitung, Design-Prompt aktualisiert
</commit_message>
<xml_diff>
--- a/doku/Steckbrief_HydroDesk_Base.docx
+++ b/doku/Steckbrief_HydroDesk_Base.docx
@@ -53,7 +53,7 @@
         <w:rPr>
           <w:sz w:val="22"/>
         </w:rPr>
-        <w:t>Projektidee: Ein flaches, rechteckiges ESP32-Gerät (ca. 180 × 95 × 20 mm) für den Schreibtisch. Links sitzt ein Touch-Display, rechts daneben eine Silikon-Fläche (ca. 90 × 90 mm), auf die jede normale Flasche gestellt wird. Eine Wägezelle unter der Fläche misst das Gewicht und rechnet es nach der gewählten Flaschengröße (Leer / 300 / 500 / 750 / 1000 / 1500 ml / Voll) in getrunkene ml um. Das Display bleibt dabei immer sichtbar und zeigt Tagesziel, Fortschritt und nächste Erinnerung. Ein Feuchtigkeitssensor um die Flaschenfläche erkennt verschüttetes Wasser und schaltet die Stromversorgung ab (Sicherheit). Optional: Erinnerung und Status per Telegram.</w:t>
+        <w:t>Projektidee: Ein flaches, rechteckiges ESP32-Gerät (180 × 100 × 25 mm) für den Schreibtisch. Links sitzt das Board CYD ESP32-2432S028R mit 2,8″-Touch-Display, rechts ein Flaschen-Pad (90 × 90 mm) mit Silikonmatte für jede normale Flasche. Eine Wägezelle misst das Gewicht; per Touch-Tasten „Leer“ und „Voll“ wird die Flasche kalibriert und die getrunkene Menge in ml berechnet. Das Display zeigt Tagesziel, Fortschritt und nächste Erinnerung, eine Lichtlinie vorne (COB-LED-Streifen hinter gedrucktem Diffusor) erinnert ans Trinken. Bei verschüttetem Wasser schaltet ein Feuchtigkeitssensor den Strom ab. Per Bluetooth LE verbindet sich das Gerät mit einer Android-App (Supabase). Optional: Telegram.</w:t>
       </w:r>
     </w:p>
     <w:p>
@@ -88,7 +88,7 @@
         <w:rPr>
           <w:sz w:val="22"/>
         </w:rPr>
-        <w:t>Endprodukt: Funktionsfähiger Prototyp im rechteckigen 3D-gedruckten Gehäuse (Display links, Flaschenfläche rechts), live vorführbar, plus Quellcode im Git-Repo, CAD-Datei des Gehäuses, Lasten-/Pflichtenheft, Testprotokoll und Bericht.</w:t>
+        <w:t>Endprodukt: Funktionsfähiger Prototyp im 3D-gedruckten Gehäuse (Display links, Flaschen-Pad rechts, Lichtlinie vorne, abnehmbare USB-Kappe), live vorführbar, plus Android-App, Quellcode im Git-Repo, CAD-Datei, Lasten-/Pflichtenheft, Testprotokoll und Bericht.</w:t>
       </w:r>
     </w:p>
     <w:p>
@@ -104,7 +104,7 @@
         <w:rPr>
           <w:sz w:val="22"/>
         </w:rPr>
-        <w:t>• WLAN-Zugang und optional Telegram-Bot-Token in secrets.h (nicht im Repo)</w:t>
+        <w:t>• WLAN und optional Telegram-Token in secrets.h (nicht im Repo), BLE-Kopplung zur App</w:t>
       </w:r>
     </w:p>
     <w:p>
@@ -112,7 +112,7 @@
         <w:rPr>
           <w:sz w:val="22"/>
         </w:rPr>
-        <w:t>• Touch-Presets auf dem Display: Leer, 300 ml, 500 ml, 750 ml, 1000 ml, 1500 ml, Voll</w:t>
+        <w:t>• Flaschen-Kalibrierung per Touch: „Leer“ (leere Flasche) und „Voll“ (volle Flasche)</w:t>
       </w:r>
     </w:p>
     <w:p>
@@ -120,7 +120,7 @@
         <w:rPr>
           <w:sz w:val="22"/>
         </w:rPr>
-        <w:t>• Kalibrierung der Wägezelle (Tara / Vollgewicht der gewählten Größe dauerhaft speichern)</w:t>
+        <w:t>• Kalibrierung der Wägezelle (Tara, Leer- und Vollgewicht dauerhaft speichern)</w:t>
       </w:r>
     </w:p>
     <w:p>
@@ -136,7 +136,7 @@
         <w:rPr>
           <w:sz w:val="22"/>
         </w:rPr>
-        <w:t>• LED-Leiste an der Vorderkante: blau = Erinnerung, grün = Ziel erreicht, rot = Akku niedrig / Fehler, amber = Nässe-Sperre</w:t>
+        <w:t>• Lichtlinie vorne (COB-LED-Streifen WS2812B, 26 LEDs, Diffusor): blau = Erinnerung, grün = Ziel erreicht, rot = Akku / Fehler, amber = Nässe</w:t>
       </w:r>
     </w:p>
     <w:p>
@@ -189,7 +189,7 @@
         <w:rPr>
           <w:sz w:val="22"/>
         </w:rPr>
-        <w:t>Person B: Touch-Display und Bedienoberfläche, WLAN/NTP, optionale Telegram-Anbindung, Kalibrierungs- und Preset-Logik, Doku-Leitung.</w:t>
+        <w:t>Person B: Touch-Display und Bedienoberfläche, WLAN/NTP, optionale Telegram-Anbindung, Leer/Voll-Kalibrierung, Doku-Leitung.</w:t>
       </w:r>
     </w:p>
     <w:p>
@@ -230,7 +230,7 @@
         <w:rPr>
           <w:sz w:val="22"/>
         </w:rPr>
-        <w:t>Inhalte: Mikrocontroller-Programmierung in C/C++, Sensorik (Wägezelle, Feuchtigkeitseingang), Touch-Bedienoberfläche, Zustandsautomat (UML), optional HTTPS/Telegram, Umgang mit Zugangsdaten, Git, CAD-Konstruktion, Testen und Dokumentieren.</w:t>
+        <w:t>Inhalte: Mikrocontroller-Programmierung in C/C++, Sensorik (Wägezelle, Feuchtigkeitseingang), Touch-Bedienoberfläche, Zustandsautomat (UML), Bluetooth LE, Android-App, optional Telegram, Umgang mit Zugangsdaten, Git, CAD, Testen und Dokumentieren.</w:t>
       </w:r>
     </w:p>
     <w:p>
@@ -238,7 +238,7 @@
         <w:rPr>
           <w:sz w:val="22"/>
         </w:rPr>
-        <w:t>Techniken: PlatformIO (Arduino-Framework), ESP32, HX711 + Wägezelle, rechteckiges SPI-Touch-Display ca. 2,4–2,8″ (z. B. ILI9341 mit Touch), WS2812-LED-Leiste, TP4056/USB-C-Laden, Power-Management, Gehäuse-Konstruktion mit Tinkercad, Fusion 360 oder OpenSCAD.</w:t>
+        <w:t>Techniken: PlatformIO (Arduino), CYD ESP32-2432S028R (2,8″-Touch), HX711 + Wägezelle 5 kg, COB-LED-Streifen WS2812B mit Diffusor, LiPo + TC4056/USB-C + Pololu S13V10F5, Nässe-Abschaltung (Regensensor + FET), Bluetooth LE, Android-App (Kotlin, Supabase), OpenSCAD.</w:t>
       </w:r>
     </w:p>
     <w:p>
@@ -246,7 +246,7 @@
         <w:rPr>
           <w:sz w:val="22"/>
         </w:rPr>
-        <w:t>Schritte: 1. Lasten-/Pflichtenheft, Zustandsdiagramm  2. Entwicklungsumgebung, Sensor- und Display-Test  3. Wäge-Kalibrierung und Presets  4. Feuchtigkeits-Sicherheitsabschaltung  5. Bedienoberfläche + optional Telegram  6. Gehäuse konstruieren, drucken, Integration  7. Tests  8. Doku und Präsentation</w:t>
+        <w:t>Schritte: 1. Lasten-/Pflichtenheft, Zustandsdiagramm  2. Entwicklungsumgebung, Sensor- und Display-Test  3. Wäge-Kalibrierung (Leer/Voll)  4. Feuchtigkeits-Sicherheitsabschaltung  5. Bedienoberfläche, Bluetooth LE + Android-App, optional Telegram  6. Gehäuse konstruieren, drucken, Integration  7. Tests  8. Doku und Präsentation</w:t>
       </w:r>
     </w:p>
     <w:p>
@@ -254,7 +254,7 @@
         <w:rPr>
           <w:sz w:val="22"/>
         </w:rPr>
-        <w:t>Zielkonfiguration: Rechteckiges Gerät mit Akku/USB-C; Flasche rechts neben dem Display abstellen → ml-Anzeige innerhalb weniger Sekunden nach Kalibrierung; Flaschengröße per Touch wählbar; bei Wasser auf der Fläche Strom aus und Sperrbildschirm; Erinnerung per LED und optional Telegram.</w:t>
+        <w:t>Zielkonfiguration: Gerät 180 × 100 × 25 mm mit Akku und USB-C-Laden; Flasche abstellen → ml-Anzeige wenige Sekunden nach der Leer/Voll-Kalibrierung; bei Wasser Strom aus und Sperrbildschirm; Erinnerung per Lichtlinie, Daten per BLE in der App.</w:t>
       </w:r>
     </w:p>
     <w:p/>
@@ -283,7 +283,7 @@
         <w:rPr>
           <w:sz w:val="22"/>
         </w:rPr>
-        <w:t>Schüler: Laptop mit VS Code + PlatformIO, CAD-Software (Tinkercad, Fusion 360 oder OpenSCAD), Smartphone mit Telegram (optional), Handy-Hotspot für die Demo, eigener GitHub-Account.</w:t>
+        <w:t>Schüler: Laptop mit VS Code + PlatformIO, Android Studio, OpenSCAD; Android-Smartphone, Handy-Hotspot für die Demo, GitHub-Account.</w:t>
       </w:r>
     </w:p>
     <w:p>
@@ -291,7 +291,7 @@
         <w:rPr>
           <w:sz w:val="22"/>
         </w:rPr>
-        <w:t>Von Schule / Betreuer (ca. 55–90 €): ESP32-DevKit, Wägezelle 1–5 kg + HX711, rechteckiges Touch-Display 2,4–2,8″, WS2812-LED-Leiste, Feuchtigkeitssensor, LiPo 3,7 V + USB-C-Lademodul mit Schutz, Jumperkabel, Silikon-Pad, Messschieber; 3D-Druck des Gehäuses (Schul-Drucker, FabLab oder Druckdienst); optional Breadboard und Lötstation.</w:t>
+        <w:t>Von Schule / Betreuer (ca. 139 € laut Vorkalkulation, ca. 123 € ohne PLA): CYD ESP32-2432S028R, Wägezelle 5 kg + HX711, COB-LED-Streifen, Regensensor + FET-Modul, LiPo + TC4056 + Pololu S13V10F5, Silikonmatte, Kleinteile, Messschieber, Lötstation; 3D-Druck des Gehäuses; optional Breadboard.</w:t>
       </w:r>
     </w:p>
     <w:p>

</xml_diff>

<commit_message>
Doku V4: Vorkalkulation 141,81 € (ohne PLA 125,32 €) mit AO3401A von Reichelt + FET-Platine/Schalter-Teilen (Preise 09.10.2026), Einkaufsliste beide Körbe (111,04 € / 94,98 €), Steckbrief (Ein/Aus-Schalter, Stromsparen, Laufzeit geschätzt), Stromsparplan als umgesetzt + Messplan, README (Funktionen, Laufzeit, Kosten, Renders)
</commit_message>
<xml_diff>
--- a/doku/Steckbrief_HydroDesk_Base.docx
+++ b/doku/Steckbrief_HydroDesk_Base.docx
@@ -53,7 +53,7 @@
         <w:rPr>
           <w:sz w:val="22"/>
         </w:rPr>
-        <w:t>Projektidee: Ein flaches, rechteckiges ESP32-Gerät (180 × 100 × 25 mm) für den Schreibtisch. Links sitzt das Board CYD ESP32-2432S028R mit 2,8″-Touch-Display, rechts ein Flaschen-Pad (90 × 90 mm) mit Silikonmatte für jede normale Flasche. Eine Wägezelle misst das Gewicht; per Touch-Tasten „Leer“ und „Voll“ wird die Flasche kalibriert und die getrunkene Menge in ml berechnet. Das Display zeigt Tagesziel, Fortschritt und nächste Erinnerung, eine Lichtlinie vorne (COB-LED-Streifen hinter gedrucktem Diffusor) erinnert ans Trinken. Bei verschüttetem Wasser schaltet ein Feuchtigkeitssensor den Strom ab. Per Bluetooth LE verbindet sich das Gerät mit einer Android-App (Supabase). Optional: Telegram.</w:t>
+        <w:t>Projektidee: Ein flaches, rechteckiges ESP32-Gerät (180 × 100 × 25 mm) für den Schreibtisch. Links sitzt das Board CYD ESP32-2432S028R mit 2,8″-Touch-Display, rechts ein Flaschen-Pad (90 × 90 mm) mit Silikonmatte für jede normale Flasche. Eine Wägezelle misst das Gewicht; per Touch-Tasten „Leer“ und „Voll“ wird die Flasche kalibriert und die getrunkene Menge in ml berechnet. Das Display zeigt Tagesziel, Fortschritt und nächste Erinnerung, eine Lichtlinie vorne (COB-LED-Streifen hinter gedrucktem Diffusor) erinnert ans Trinken. Bei verschüttetem Wasser schaltet ein Feuchtigkeitssensor den Strom ab, ein Schalter trennt den Akku ab. Per Bluetooth LE verbindet sich das Gerät mit einer Android-App (Supabase). Optional: Telegram.</w:t>
       </w:r>
     </w:p>
     <w:p>
@@ -88,7 +88,7 @@
         <w:rPr>
           <w:sz w:val="22"/>
         </w:rPr>
-        <w:t>Endprodukt: Funktionsfähiger Prototyp im 3D-gedruckten Gehäuse (Display links, Flaschen-Pad rechts, Lichtlinie vorne, abnehmbare USB-Kappe), live vorführbar, plus Android-App, Quellcode im Git-Repo, CAD-Datei, Lasten-/Pflichtenheft, Testprotokoll und Bericht.</w:t>
+        <w:t>Endprodukt: Funktionsfähiger Prototyp im 3D-gedruckten Gehäuse (Display links, Flaschen-Pad rechts, Lichtlinie vorne, Ein/Aus-Schalter links, abnehmbare USB-Kappe), live vorführbar, plus Android-App, Quellcode im Git-Repo, CAD-Datei, Lasten-/Pflichtenheft, Testprotokoll und Bericht.</w:t>
       </w:r>
     </w:p>
     <w:p>
@@ -128,7 +128,7 @@
         <w:rPr>
           <w:sz w:val="22"/>
         </w:rPr>
-        <w:t>• Feuchtigkeits-Schwelle: bei Nässe → Strom aus und Sperrbildschirm „WASSER ERKANNT · STROM AUS“</w:t>
+        <w:t>• Feuchtigkeits-Schwelle: bei Nässe → LED-Strom aus und Sperrbildschirm „WASSER ERKANNT · STROM AUS“</w:t>
       </w:r>
     </w:p>
     <w:p>
@@ -136,7 +136,7 @@
         <w:rPr>
           <w:sz w:val="22"/>
         </w:rPr>
-        <w:t>• Lichtlinie vorne (COB-LED-Streifen WS2812B, 26 LEDs, Diffusor): blau = Erinnerung, grün = Ziel erreicht, rot = Akku / Fehler, amber = Nässe</w:t>
+        <w:t>• Lichtlinie vorne (COB-LED-Streifen WS2812B, 26 LEDs, Diffusor): blau = Erinnerung, grün = Ziel erreicht, rot = Akku / Fehler, bei Nässe aus</w:t>
       </w:r>
     </w:p>
     <w:p>
@@ -181,7 +181,7 @@
         <w:rPr>
           <w:sz w:val="22"/>
         </w:rPr>
-        <w:t>Person A: Hardware, Verkabelung, Wägezelle (HX711), Feuchtigkeitssensor, Stromversorgung (LiPo, USB-C, Sicherheitsabschaltung), rechteckiges Gehäuse (CAD + 3D-Druck), Zustandsautomat.</w:t>
+        <w:t>Person A: Hardware, Verkabelung, Wägezelle (HX711), Feuchtigkeitssensor, Stromversorgung (LiPo, USB-C, Ein/Aus-Schalter, Sicherheitsabschaltung), rechteckiges Gehäuse (CAD + 3D-Druck), Zustandsautomat.</w:t>
       </w:r>
     </w:p>
     <w:p>
@@ -238,7 +238,7 @@
         <w:rPr>
           <w:sz w:val="22"/>
         </w:rPr>
-        <w:t>Techniken: PlatformIO (Arduino), CYD ESP32-2432S028R (2,8″-Touch), HX711 + Wägezelle 5 kg, COB-LED-Streifen WS2812B mit Diffusor, LiPo + TC4056/USB-C + Pololu S13V10F5, Nässe-Abschaltung (Regensensor + FET), Bluetooth LE, Android-App (Kotlin, Supabase), OpenSCAD.</w:t>
+        <w:t>Techniken: PlatformIO (Arduino), CYD ESP32-2432S028R (2,8″-Touch), HX711 + Wägezelle 5 kg, COB-LED-Streifen WS2812B mit Diffusor, LiPo + TC4056/USB-C + Pololu S13V10F5, Nässe-Abschaltung (Regensensor + AO3401A), Ein/Aus-Schalter, Stromsparen, Bluetooth LE, Android-App (Kotlin, Supabase), OpenSCAD.</w:t>
       </w:r>
     </w:p>
     <w:p>
@@ -254,7 +254,7 @@
         <w:rPr>
           <w:sz w:val="22"/>
         </w:rPr>
-        <w:t>Zielkonfiguration: Gerät 180 × 100 × 25 mm mit Akku und USB-C-Laden; Flasche abstellen → ml-Anzeige wenige Sekunden nach der Leer/Voll-Kalibrierung; bei Wasser Strom aus und Sperrbildschirm; Erinnerung per Lichtlinie, Daten per BLE in der App.</w:t>
+        <w:t>Zielkonfiguration: Gerät 180 × 100 × 25 mm mit Akku, USB-C-Laden und Ein/Aus-Schalter; Flasche abstellen → ml-Anzeige wenige Sekunden nach der Leer/Voll-Kalibrierung; bei Wasser Strom aus und Sperrbildschirm; Erinnerung per Lichtlinie, Daten per BLE in der App; Akkulaufzeit geschätzt ca. 27–54 h.</w:t>
       </w:r>
     </w:p>
     <w:p/>
@@ -291,7 +291,7 @@
         <w:rPr>
           <w:sz w:val="22"/>
         </w:rPr>
-        <w:t>Von Schule / Betreuer (ca. 139 € laut Vorkalkulation, ca. 123 € ohne PLA): CYD ESP32-2432S028R, Wägezelle 5 kg + HX711, COB-LED-Streifen, Regensensor + FET-Modul, LiPo + TC4056 + Pololu S13V10F5, Silikonmatte, Kleinteile, Messschieber, Lötstation; 3D-Druck des Gehäuses; optional Breadboard.</w:t>
+        <w:t>Von Schule / Betreuer (ca. 142 € laut Vorkalkulation, ca. 125 € ohne PLA): CYD ESP32-2432S028R, Wägezelle 5 kg + HX711, COB-LED-Streifen, Regensensor, FET-Platine + Ein/Aus-Schalter, LiPo + TC4056 + Pololu S13V10F5, Silikonmatte, Kleinteile, Messschieber, Lötstation; 3D-Druck des Gehäuses; optional Breadboard.</w:t>
       </w:r>
     </w:p>
     <w:p>

</xml_diff>